<commit_message>
Final stable version with save report button and installer build
</commit_message>
<xml_diff>
--- a/test_data/sample_manuscript.docx
+++ b/test_data/sample_manuscript.docx
@@ -846,18 +846,7 @@
           <w:szCs w:val="20"/>
           <w:lang w:val="en-US"/>
         </w:rPr>
-        <w:t>Taken together, these readings indicate that the musical terms in Çengnâme belong both to the technical vocabulary of the edvâr tradition and to the poem’s allegorical and Sufi world. Perde evokes concealment and disclosure; âvâze, sound and secrecy; seyir, movement and orientation; şûbe, the relation between part and whole; and terkib, combination and reconstitution. These associations do not imply that Ahmed-i Dâî constructed a closed and systematic Pythagorean cosmology in Çengnâme. The esoteric-symbolic approach is used here in a limited sense, as a means of exploring the meanings that these terms may have carried within their historical and literary context. Further research on Çengnâme would benefit from an interdisciplinary</w:t>
-      </w:r>
-      <w:bookmarkStart w:id="1" w:name="_GoBack"/>
-      <w:bookmarkEnd w:id="1"/>
-      <w:r>
-        <w:rPr>
-          <w:color w:val="000000" w:themeColor="text1"/>
-          <w:sz w:val="20"/>
-          <w:szCs w:val="20"/>
-          <w:lang w:val="en-US"/>
-        </w:rPr>
-        <w:t xml:space="preserve"> approach combining musicology, literary studies, the history of Sufism, and cultural history, while remaining attentive to the historical distance between the terminology of the poem and the later theoretical languages through which it has been interpreted.</w:t>
+        <w:t>Taken together, these readings indicate that the musical terms in Çengnâme belong both to the technical vocabulary of the edvâr tradition and to the poem’s allegorical and Sufi world. Perde evokes concealment and disclosure; âvâze, sound and secrecy; seyir, movement and orientation; şûbe, the relation between part and whole; and terkib, combination and reconstitution. These associations do not imply that Ahmed-i Dâî constructed a closed and systematic Pythagorean cosmology in Çengnâme. The esoteric-symbolic approach is used here in a limited sense, as a means of exploring the meanings that these terms may have carried within their historical and literary context. Further research on Çengnâme would benefit from an interdisciplinary approach combining musicology, literary studies, the history of Sufism, and cultural history, while remaining attentive to the historical distance between the terminology of the poem and the later theoretical languages through which it has been interpreted.</w:t>
       </w:r>
     </w:p>
     <w:p>
@@ -1851,7 +1840,7 @@
         </w:rPr>
         <w:t xml:space="preserve">3.1. </w:t>
       </w:r>
-      <w:bookmarkStart w:id="2" w:name="_Toc439759042"/>
+      <w:bookmarkStart w:id="1" w:name="_Toc439759042"/>
       <w:r>
         <w:rPr>
           <w:b/>
@@ -6527,7 +6516,7 @@
         </w:rPr>
       </w:pPr>
     </w:p>
-    <w:bookmarkEnd w:id="2"/>
+    <w:bookmarkEnd w:id="1"/>
     <w:p>
       <w:pPr>
         <w:spacing w:after="0"/>
@@ -6877,323 +6866,11 @@
         <w:rPr>
           <w:color w:val="000000" w:themeColor="text1"/>
           <w:sz w:val="22"/>
-        </w:rPr>
-      </w:pPr>
-      <w:r>
-        <w:rPr>
-          <w:color w:val="000000" w:themeColor="text1"/>
-          <w:sz w:val="22"/>
-        </w:rPr>
-        <w:lastRenderedPageBreak/>
-        <w:t>Feldman, Walter, Music of the Ottoman Court: Makam, Composition and the Early Ottoman Instrumental Repertoire, Brill, Leiden 2024.</w:t>
-      </w:r>
-    </w:p>
-    <w:p>
-      <w:pPr>
-        <w:spacing w:after="0"/>
-        <w:ind w:left="0" w:firstLine="567"/>
-        <w:rPr>
-          <w:color w:val="000000" w:themeColor="text1"/>
-          <w:sz w:val="22"/>
-        </w:rPr>
-      </w:pPr>
-      <w:r>
-        <w:rPr>
-          <w:color w:val="000000" w:themeColor="text1"/>
-          <w:sz w:val="22"/>
-        </w:rPr>
-        <w:t>Kaçar, Gülçin Yahya, "Türk Mûsikîsinde Makam", İstem, Cilt 6, Sayı 11, 2008, s. 145-158.</w:t>
-      </w:r>
-    </w:p>
-    <w:p>
-      <w:pPr>
-        <w:spacing w:after="0"/>
-        <w:ind w:left="0" w:firstLine="567"/>
-        <w:rPr>
-          <w:color w:val="000000" w:themeColor="text1"/>
-          <w:sz w:val="22"/>
-        </w:rPr>
-      </w:pPr>
-      <w:r>
-        <w:rPr>
-          <w:color w:val="000000" w:themeColor="text1"/>
-          <w:sz w:val="22"/>
-        </w:rPr>
-        <w:t>Kantemiroğlu, Kitâbu 'İlmi'l-Mûsikî alâ vechi'l-hurûfât: Mûsikîyi Harflerle Tesbit ve İcrâ İlminin Kitabı, haz. Yalçın Tura, Yapı Kredi Yayınları, İstanbul 2001.</w:t>
-      </w:r>
-    </w:p>
-    <w:p>
-      <w:pPr>
-        <w:spacing w:after="0"/>
-        <w:ind w:left="0" w:firstLine="567"/>
-        <w:rPr>
-          <w:color w:val="000000" w:themeColor="text1"/>
-          <w:sz w:val="22"/>
-        </w:rPr>
-      </w:pPr>
-      <w:r>
-        <w:rPr>
-          <w:color w:val="000000" w:themeColor="text1"/>
-          <w:sz w:val="22"/>
-        </w:rPr>
-        <w:t>Kılıç, Mahmud Erol, Sûfî ve Şiir: Osmanlı Tasavvuf Şiirinin Poetikası, Sufi Kitap, İstanbul 2017.</w:t>
-      </w:r>
-    </w:p>
-    <w:p>
-      <w:pPr>
-        <w:spacing w:after="0"/>
-        <w:ind w:left="0" w:firstLine="567"/>
-        <w:rPr>
-          <w:color w:val="000000" w:themeColor="text1"/>
-          <w:sz w:val="22"/>
-        </w:rPr>
-      </w:pPr>
-      <w:r>
-        <w:rPr>
-          <w:color w:val="000000" w:themeColor="text1"/>
-          <w:sz w:val="22"/>
-        </w:rPr>
-        <w:t>Kutluğ, Yakup Fikret, Türk Musikisinde Makamlar, Yapı Kredi Yayınları, İstanbul 2000.</w:t>
-      </w:r>
-    </w:p>
-    <w:p>
-      <w:pPr>
-        <w:spacing w:after="0"/>
-        <w:ind w:left="0" w:firstLine="567"/>
-        <w:rPr>
-          <w:color w:val="000000" w:themeColor="text1"/>
-          <w:sz w:val="22"/>
-        </w:rPr>
-      </w:pPr>
-      <w:r>
-        <w:rPr>
-          <w:color w:val="000000" w:themeColor="text1"/>
-          <w:sz w:val="22"/>
-        </w:rPr>
-        <w:t>Onay, Ahmet Talat, Eski Türk Edebiyatında Mazmunlar ve İzahı, haz. Cemâl Kurnaz, Akçağ Yayınları, Ankara 2000.</w:t>
-      </w:r>
-    </w:p>
-    <w:p>
-      <w:pPr>
-        <w:spacing w:after="0"/>
-        <w:ind w:left="0" w:firstLine="567"/>
-        <w:rPr>
-          <w:color w:val="000000" w:themeColor="text1"/>
-          <w:sz w:val="22"/>
-        </w:rPr>
-      </w:pPr>
-      <w:r>
-        <w:rPr>
-          <w:color w:val="000000" w:themeColor="text1"/>
-          <w:sz w:val="22"/>
-        </w:rPr>
-        <w:t>Öztürk, Okan Murat, "Makam, Âvâze, Şûbe ve Terkib: Osmanlı Musiki Nazariyatında Pisagorcu 'Kürelerin Uyumu/Musikisi' Anlayışının Temsili", Rast Müzikoloji Dergisi, Cilt 2, Sayı 1, 2014, s. 1-49.</w:t>
-      </w:r>
-    </w:p>
-    <w:p>
-      <w:pPr>
-        <w:spacing w:after="0"/>
-        <w:ind w:left="0" w:firstLine="567"/>
-        <w:rPr>
-          <w:color w:val="000000" w:themeColor="text1"/>
-          <w:sz w:val="22"/>
-        </w:rPr>
-      </w:pPr>
-      <w:r>
-        <w:rPr>
-          <w:color w:val="000000" w:themeColor="text1"/>
-          <w:sz w:val="22"/>
-        </w:rPr>
-        <w:t>Öztürk, Okan Murat, Beşiroğlu, Şehvar Şahin ve Bayraktarkatal, Mehmet Emin, "Makamı Anlamak: Makam Nazariyat Tarihinde Başlıca Modeller", Porte Akademik Müzik ve Dans Araştırmaları Dergisi, Sayı 10, 2014, s. 9-36.</w:t>
-      </w:r>
-    </w:p>
-    <w:p>
-      <w:pPr>
-        <w:spacing w:after="0"/>
-        <w:ind w:left="0" w:firstLine="567"/>
-        <w:rPr>
-          <w:color w:val="000000" w:themeColor="text1"/>
-          <w:sz w:val="22"/>
-        </w:rPr>
-      </w:pPr>
-      <w:r>
-        <w:rPr>
-          <w:color w:val="000000" w:themeColor="text1"/>
-          <w:sz w:val="22"/>
-        </w:rPr>
-        <w:t>Popescu-Judetz, Eugenia, Meanings in Turkish Musical Culture, Pan Yayıncılık, İstanbul 1996.</w:t>
-      </w:r>
-    </w:p>
-    <w:p>
-      <w:pPr>
-        <w:spacing w:after="0"/>
-        <w:ind w:left="0" w:firstLine="567"/>
-        <w:rPr>
-          <w:color w:val="000000" w:themeColor="text1"/>
-          <w:sz w:val="22"/>
-        </w:rPr>
-      </w:pPr>
-      <w:r>
-        <w:rPr>
-          <w:color w:val="000000" w:themeColor="text1"/>
-          <w:sz w:val="22"/>
-        </w:rPr>
-        <w:t>Say, Ahmet, Müzik Sözlüğü, Müzik Ansiklopedisi Yayınları, Ankara 2002.</w:t>
-      </w:r>
-    </w:p>
-    <w:p>
-      <w:pPr>
-        <w:spacing w:after="0"/>
-        <w:ind w:left="0" w:firstLine="567"/>
-        <w:rPr>
-          <w:color w:val="000000" w:themeColor="text1"/>
-          <w:sz w:val="22"/>
-        </w:rPr>
-      </w:pPr>
-      <w:r>
-        <w:rPr>
-          <w:color w:val="000000" w:themeColor="text1"/>
-          <w:sz w:val="22"/>
-        </w:rPr>
-        <w:t>Schimmel, Annemarie, Sayıların Gizemi, çev. Mustafa Küpüşoğlu, Kabalcı Yayınevi, İstanbul 1998.</w:t>
-      </w:r>
-    </w:p>
-    <w:p>
-      <w:pPr>
-        <w:spacing w:after="0"/>
-        <w:ind w:left="0" w:firstLine="567"/>
-        <w:rPr>
-          <w:color w:val="000000" w:themeColor="text1"/>
-          <w:sz w:val="22"/>
-        </w:rPr>
-      </w:pPr>
-      <w:r>
-        <w:rPr>
-          <w:color w:val="000000" w:themeColor="text1"/>
-          <w:sz w:val="22"/>
-        </w:rPr>
-        <w:t>Signell, Karl L., Makam: Türk Sanat Musikisinde Makam Uygulaması, Yapı Kredi Yayınları, İstanbul 2006.</w:t>
-      </w:r>
-    </w:p>
-    <w:p>
-      <w:pPr>
-        <w:spacing w:after="0"/>
-        <w:ind w:left="0" w:firstLine="567"/>
-        <w:rPr>
-          <w:color w:val="000000" w:themeColor="text1"/>
-          <w:sz w:val="22"/>
-        </w:rPr>
-      </w:pPr>
-      <w:r>
-        <w:rPr>
-          <w:color w:val="000000" w:themeColor="text1"/>
-          <w:sz w:val="22"/>
-        </w:rPr>
-        <w:t>Tura, Yalçın, Türk Mûsıkîsinin Mes'eleleri, Pan Yayıncılık, İstanbul 1988.</w:t>
-      </w:r>
-    </w:p>
-    <w:p>
-      <w:pPr>
-        <w:spacing w:after="0"/>
-        <w:ind w:left="0" w:firstLine="567"/>
-        <w:rPr>
-          <w:color w:val="000000" w:themeColor="text1"/>
-          <w:sz w:val="22"/>
-        </w:rPr>
-      </w:pPr>
-      <w:r>
-        <w:rPr>
-          <w:color w:val="000000" w:themeColor="text1"/>
-          <w:sz w:val="22"/>
-        </w:rPr>
-        <w:t>Türk Dil Kurumu, Türkçe Sözlük, Milliyet Yayınları, İstanbul 1992.</w:t>
-      </w:r>
-    </w:p>
-    <w:p>
-      <w:pPr>
-        <w:spacing w:after="0"/>
-        <w:ind w:left="0" w:firstLine="567"/>
-        <w:rPr>
-          <w:color w:val="000000" w:themeColor="text1"/>
-          <w:sz w:val="22"/>
-        </w:rPr>
-      </w:pPr>
-      <w:r>
-        <w:rPr>
-          <w:color w:val="000000" w:themeColor="text1"/>
-          <w:sz w:val="22"/>
-        </w:rPr>
-        <w:t>Urmevî, Safiyyüddin Abdülmümin, Kitâbü'l-Edvâr, inceleme, neşir ve çev. Mehmet Nuri Uygun, İbn Haldun Üniversitesi Yayınları, İstanbul 2019.</w:t>
-      </w:r>
-    </w:p>
-    <w:p>
-      <w:pPr>
-        <w:spacing w:after="0"/>
-        <w:ind w:left="0" w:firstLine="567"/>
-        <w:rPr>
-          <w:color w:val="000000" w:themeColor="text1"/>
-          <w:sz w:val="22"/>
-        </w:rPr>
-      </w:pPr>
-      <w:r>
-        <w:rPr>
-          <w:color w:val="000000" w:themeColor="text1"/>
-          <w:sz w:val="22"/>
-        </w:rPr>
-        <w:t>Uygun, Mehmet Nuri, Safiyyüddin Abdülmü'min Urmevî ve Kitabü'l-Edvârı, Kubbealtı Neşriyatı, İstanbul 1999.</w:t>
-      </w:r>
-    </w:p>
-    <w:p>
-      <w:pPr>
-        <w:spacing w:after="0"/>
-        <w:ind w:left="0" w:firstLine="567"/>
-        <w:rPr>
-          <w:color w:val="000000" w:themeColor="text1"/>
-          <w:sz w:val="22"/>
-        </w:rPr>
-      </w:pPr>
-      <w:r>
-        <w:rPr>
-          <w:color w:val="000000" w:themeColor="text1"/>
-          <w:sz w:val="22"/>
-        </w:rPr>
-        <w:t>Wright, Owen, The Modal System of Arab and Persian Music, A.D. 1250-1300, Oxford University Press, Oxford 1978.</w:t>
-      </w:r>
-    </w:p>
-    <w:p>
-      <w:pPr>
-        <w:spacing w:after="0"/>
-        <w:ind w:left="0" w:firstLine="567"/>
-        <w:rPr>
-          <w:color w:val="000000" w:themeColor="text1"/>
-          <w:sz w:val="22"/>
-        </w:rPr>
-      </w:pPr>
-      <w:r>
-        <w:rPr>
-          <w:color w:val="000000" w:themeColor="text1"/>
-          <w:sz w:val="22"/>
-        </w:rPr>
-        <w:t>Wright, Owen, "ʿAbd al-Qādir al-Marāghī and ʿAlī b. Muḥammad Bināʾī: Two Fifteenth-Century Examples of Notation: Part 1: Text", Bulletin of the School of Oriental and African Studies, Cilt 57, Sayı 3, 1994, s. 475-515.</w:t>
-      </w:r>
-    </w:p>
-    <w:p>
-      <w:pPr>
-        <w:spacing w:after="0"/>
-        <w:ind w:left="0" w:firstLine="567"/>
-        <w:rPr>
-          <w:color w:val="000000" w:themeColor="text1"/>
-          <w:sz w:val="22"/>
-          <w:szCs w:val="22"/>
-        </w:rPr>
-      </w:pPr>
-      <w:r>
-        <w:rPr>
-          <w:color w:val="000000" w:themeColor="text1"/>
-          <w:sz w:val="22"/>
-        </w:rPr>
-        <w:t>Wright, Owen, "A Preliminary Version of the Kitāb al-Adwār", Bulletin of the School of Oriental and African Studies, Cilt 58, Sayı 3, 1995, s. 455-478.</w:t>
-      </w:r>
+          <w:szCs w:val="22"/>
+        </w:rPr>
+      </w:pPr>
+      <w:bookmarkStart w:id="2" w:name="_GoBack"/>
+      <w:bookmarkEnd w:id="2"/>
     </w:p>
     <w:sectPr>
       <w:headerReference w:type="even" r:id="rId8"/>
@@ -7594,7 +7271,7 @@
             <w:sz w:val="20"/>
             <w:szCs w:val="20"/>
           </w:rPr>
-          <w:t>20</w:t>
+          <w:t>18</w:t>
         </w:r>
         <w:r>
           <w:rPr>
@@ -7821,7 +7498,7 @@
                     <w:sz w:val="20"/>
                     <w:szCs w:val="22"/>
                   </w:rPr>
-                  <w:t>19</w:t>
+                  <w:t>17</w:t>
                 </w:r>
                 <w:r>
                   <w:rPr>
@@ -9763,7 +9440,7 @@
 </file>
 
 <file path=customXml/itemProps1.xml><?xml version="1.0" encoding="utf-8"?>
-<ds:datastoreItem xmlns:ds="http://schemas.openxmlformats.org/officeDocument/2006/customXml" ds:itemID="{A3357506-41AB-406B-A5B5-A0539C4F8ECA}">
+<ds:datastoreItem xmlns:ds="http://schemas.openxmlformats.org/officeDocument/2006/customXml" ds:itemID="{CD2D1C42-275D-42B7-8037-051D9D6A1ED7}">
   <ds:schemaRefs>
     <ds:schemaRef ds:uri="http://schemas.openxmlformats.org/officeDocument/2006/bibliography"/>
   </ds:schemaRefs>

</xml_diff>